<commit_message>
fix(paper): expand SECI at first use in abstract and body
SECI was expanded only in the Abbreviations list, unlike HITL-KG, DSR,
and AACODS which are defined at first use in both the abstract and the
body (JMIR style treats them as separate units; Reviewer Q's R1 comment
requested clear acronym definitions). Now reads 'Nonaka's SECI
(Socialization, Externalization, Combination, Internalization) model' at
first use in each. Compensating trims keep the JMIR-method count at
4,990/5,000 (abstract 270/450). Artifacts rebuilt; abstract plaintext and
tracked-changes DOCX regenerated; package refreshed.

Refs #556

Co-Authored-By: Claude Fable 5 <noreply@anthropic.com>
</commit_message>
<xml_diff>
--- a/ARCHIVED/20260712_IJMR-Submission/paper.docx
+++ b/ARCHIVED/20260712_IJMR-Submission/paper.docx
@@ -71,7 +71,7 @@
         <w:pStyle w:val="Abstract"/>
       </w:pPr>
       <w:r>
-        <w:t xml:space="preserve">Viewed through Nonaka’s SECI model of knowledge creation, the root cause is a</w:t>
+        <w:t xml:space="preserve">Viewed through Nonaka’s SECI (Socialization, Externalization, Combination, Internalization) model of knowledge creation, the root cause is a</w:t>
       </w:r>
       <w:r>
         <w:t xml:space="preserve"> </w:t>
@@ -781,7 +781,7 @@
         <w:pStyle w:val="FirstParagraph"/>
       </w:pPr>
       <w:r>
-        <w:t xml:space="preserve">We ground our analysis in Nonaka’s SECI model of knowledge creation</w:t>
+        <w:t xml:space="preserve">We ground our analysis in Nonaka’s SECI (Socialization, Externalization, Combination, Internalization) model of knowledge creation</w:t>
       </w:r>
       <w:r>
         <w:t xml:space="preserve"> </w:t>
@@ -801,7 +801,7 @@
         <w:t xml:space="preserve">]</w:t>
       </w:r>
       <w:r>
-        <w:t xml:space="preserve">, informed by a narrative review of the literature across healthcare analytics maturity, workforce turnover dynamics, and natural language processing, with grey literature assessed using the AACODS (Authority, Accuracy, Coverage, Objectivity, Date, Significance) checklist</w:t>
+        <w:t xml:space="preserve">, informed by a narrative literature review across healthcare analytics maturity, workforce turnover, and natural language processing, with grey literature assessed using the AACODS (Authority, Accuracy, Coverage, Objectivity, Date, Significance) checklist</w:t>
       </w:r>
       <w:r>
         <w:t xml:space="preserve"> </w:t>
@@ -821,7 +821,7 @@
         <w:t xml:space="preserve">]</w:t>
       </w:r>
       <w:r>
-        <w:t xml:space="preserve">. Grey literature was retained only when no peer-reviewed equivalent existed or when it provided unique industry data. The SECI model describes organizational knowledge as emerging through a continuous cycle of four conversion modes:</w:t>
+        <w:t xml:space="preserve">. Grey literature was retained only when no peer-reviewed equivalent existed or when it provided unique industry data. The model describes organizational knowledge as emerging through a continuous cycle of four conversion modes:</w:t>
       </w:r>
     </w:p>
     <w:p>

</xml_diff>